<commit_message>
refactor: update canonical data models, remove GSWS table schemas, and adjust Milvus vector indices.
</commit_message>
<xml_diff>
--- a/project_architecture_and_algorithms.docx
+++ b/project_architecture_and_algorithms.docx
@@ -133,11 +133,9 @@
         <w:rPr>
           <w:rFonts w:ascii="Times New Roman" w:hAnsi="Times New Roman"/>
           <w:b w:val="0"/>
-          <w:i w:val="0"/>
-          <w:color w:val="000000"/>
           <w:sz w:val="22"/>
         </w:rPr>
-        <w:t>This specification details the design, implementation, and verification protocols of the Natural Language to SQL (NL2SQL) translation engine developed for student dropout risk analysis. The system provides interfaces to convert user queries regarding student demographics, school characteristics, academic performance, attendance, and welfare benefit disbursements into optimized, syntactically valid SQL queries. The primary design objective is to enable natural language interaction with structured database systems while mitigating common LLM failure modes such as schema hallucination, invalid column joins, and structural errors.</w:t>
+        <w:t>This specification details the design, implementation, and verification protocols of the Natural Language to SQL (NL2SQL) translation engine developed for student dropout risk analysis. The system provides interfaces to convert user queries regarding student demographics, school characteristics, academic performance, attendance, and welfare benefit disbursements into optimized, syntactically valid SQL queries. The primary design objective is to enable natural language interaction with structured database systems while mitigating common LLM failure modes such as schema hallucination, invalid column joins, and structural errors [1], [6].</w:t>
       </w:r>
     </w:p>
     <w:p>
@@ -169,6 +167,485 @@
           <w:sz w:val="22"/>
         </w:rPr>
         <w:t>The system follows a modular, reasoning-first paradigm where retrieval, orchestration, and execution are strictly separated. This design ensures that the Large Language Model (LLM) is not forced to rely on unstructured parametric memory for physical table layouts, and is instead heavily anchored via retrieved context.</w:t>
+      </w:r>
+    </w:p>
+    <w:p>
+      <w:pPr>
+        <w:spacing w:line="240" w:lineRule="auto" w:before="0" w:after="0"/>
+      </w:pPr>
+      <w:r>
+        <w:rPr>
+          <w:rFonts w:ascii="Consolas" w:hAnsi="Consolas"/>
+          <w:b w:val="0"/>
+          <w:sz w:val="19"/>
+        </w:rPr>
+      </w:r>
+    </w:p>
+    <w:p>
+      <w:pPr>
+        <w:spacing w:line="240" w:lineRule="auto" w:before="0" w:after="0"/>
+      </w:pPr>
+      <w:r>
+        <w:rPr>
+          <w:rFonts w:ascii="Consolas" w:hAnsi="Consolas"/>
+          <w:b w:val="0"/>
+          <w:sz w:val="19"/>
+        </w:rPr>
+        <w:t xml:space="preserve">                 User Query</w:t>
+      </w:r>
+    </w:p>
+    <w:p>
+      <w:pPr>
+        <w:spacing w:line="240" w:lineRule="auto" w:before="0" w:after="0"/>
+      </w:pPr>
+      <w:r>
+        <w:rPr>
+          <w:rFonts w:ascii="Consolas" w:hAnsi="Consolas"/>
+          <w:b w:val="0"/>
+          <w:sz w:val="19"/>
+        </w:rPr>
+        <w:t xml:space="preserve">                     │</w:t>
+      </w:r>
+    </w:p>
+    <w:p>
+      <w:pPr>
+        <w:spacing w:line="240" w:lineRule="auto" w:before="0" w:after="0"/>
+      </w:pPr>
+      <w:r>
+        <w:rPr>
+          <w:rFonts w:ascii="Consolas" w:hAnsi="Consolas"/>
+          <w:b w:val="0"/>
+          <w:sz w:val="19"/>
+        </w:rPr>
+        <w:t xml:space="preserve">                     ▼</w:t>
+      </w:r>
+    </w:p>
+    <w:p>
+      <w:pPr>
+        <w:spacing w:line="240" w:lineRule="auto" w:before="0" w:after="0"/>
+      </w:pPr>
+      <w:r>
+        <w:rPr>
+          <w:rFonts w:ascii="Consolas" w:hAnsi="Consolas"/>
+          <w:b w:val="0"/>
+          <w:sz w:val="19"/>
+        </w:rPr>
+        <w:t xml:space="preserve">           ┌───────────────────┐</w:t>
+      </w:r>
+    </w:p>
+    <w:p>
+      <w:pPr>
+        <w:spacing w:line="240" w:lineRule="auto" w:before="0" w:after="0"/>
+      </w:pPr>
+      <w:r>
+        <w:rPr>
+          <w:rFonts w:ascii="Consolas" w:hAnsi="Consolas"/>
+          <w:b w:val="0"/>
+          <w:sz w:val="19"/>
+        </w:rPr>
+        <w:t xml:space="preserve">           │  FastAPI Gateway  │</w:t>
+      </w:r>
+    </w:p>
+    <w:p>
+      <w:pPr>
+        <w:spacing w:line="240" w:lineRule="auto" w:before="0" w:after="0"/>
+      </w:pPr>
+      <w:r>
+        <w:rPr>
+          <w:rFonts w:ascii="Consolas" w:hAnsi="Consolas"/>
+          <w:b w:val="0"/>
+          <w:sz w:val="19"/>
+        </w:rPr>
+        <w:t xml:space="preserve">           └─────────┬─────────┘</w:t>
+      </w:r>
+    </w:p>
+    <w:p>
+      <w:pPr>
+        <w:spacing w:line="240" w:lineRule="auto" w:before="0" w:after="0"/>
+      </w:pPr>
+      <w:r>
+        <w:rPr>
+          <w:rFonts w:ascii="Consolas" w:hAnsi="Consolas"/>
+          <w:b w:val="0"/>
+          <w:sz w:val="19"/>
+        </w:rPr>
+        <w:t xml:space="preserve">                     │</w:t>
+      </w:r>
+    </w:p>
+    <w:p>
+      <w:pPr>
+        <w:spacing w:line="240" w:lineRule="auto" w:before="0" w:after="0"/>
+      </w:pPr>
+      <w:r>
+        <w:rPr>
+          <w:rFonts w:ascii="Consolas" w:hAnsi="Consolas"/>
+          <w:b w:val="0"/>
+          <w:sz w:val="19"/>
+        </w:rPr>
+        <w:t xml:space="preserve">                     ▼</w:t>
+      </w:r>
+    </w:p>
+    <w:p>
+      <w:pPr>
+        <w:spacing w:line="240" w:lineRule="auto" w:before="0" w:after="0"/>
+      </w:pPr>
+      <w:r>
+        <w:rPr>
+          <w:rFonts w:ascii="Consolas" w:hAnsi="Consolas"/>
+          <w:b w:val="0"/>
+          <w:sz w:val="19"/>
+        </w:rPr>
+        <w:t>┌────────────────────┼──────────────────────────────────┐</w:t>
+      </w:r>
+    </w:p>
+    <w:p>
+      <w:pPr>
+        <w:spacing w:line="240" w:lineRule="auto" w:before="0" w:after="0"/>
+      </w:pPr>
+      <w:r>
+        <w:rPr>
+          <w:rFonts w:ascii="Consolas" w:hAnsi="Consolas"/>
+          <w:b w:val="0"/>
+          <w:sz w:val="19"/>
+        </w:rPr>
+        <w:t>│ LangGraph Agent    │                                  │</w:t>
+      </w:r>
+    </w:p>
+    <w:p>
+      <w:pPr>
+        <w:spacing w:line="240" w:lineRule="auto" w:before="0" w:after="0"/>
+      </w:pPr>
+      <w:r>
+        <w:rPr>
+          <w:rFonts w:ascii="Consolas" w:hAnsi="Consolas"/>
+          <w:b w:val="0"/>
+          <w:sz w:val="19"/>
+        </w:rPr>
+        <w:t>│                    ▼                                  │</w:t>
+      </w:r>
+    </w:p>
+    <w:p>
+      <w:pPr>
+        <w:spacing w:line="240" w:lineRule="auto" w:before="0" w:after="0"/>
+      </w:pPr>
+      <w:r>
+        <w:rPr>
+          <w:rFonts w:ascii="Consolas" w:hAnsi="Consolas"/>
+          <w:b w:val="0"/>
+          <w:sz w:val="19"/>
+        </w:rPr>
+        <w:t>│            [Initialize Node]                          │</w:t>
+      </w:r>
+    </w:p>
+    <w:p>
+      <w:pPr>
+        <w:spacing w:line="240" w:lineRule="auto" w:before="0" w:after="0"/>
+      </w:pPr>
+      <w:r>
+        <w:rPr>
+          <w:rFonts w:ascii="Consolas" w:hAnsi="Consolas"/>
+          <w:b w:val="0"/>
+          <w:sz w:val="19"/>
+        </w:rPr>
+        <w:t>│                    │                                  │</w:t>
+      </w:r>
+    </w:p>
+    <w:p>
+      <w:pPr>
+        <w:spacing w:line="240" w:lineRule="auto" w:before="0" w:after="0"/>
+      </w:pPr>
+      <w:r>
+        <w:rPr>
+          <w:rFonts w:ascii="Consolas" w:hAnsi="Consolas"/>
+          <w:b w:val="0"/>
+          <w:sz w:val="19"/>
+        </w:rPr>
+        <w:t>│                    ▼ (calls retrieve_schema_rag)      │</w:t>
+      </w:r>
+    </w:p>
+    <w:p>
+      <w:pPr>
+        <w:spacing w:line="240" w:lineRule="auto" w:before="0" w:after="0"/>
+      </w:pPr>
+      <w:r>
+        <w:rPr>
+          <w:rFonts w:ascii="Consolas" w:hAnsi="Consolas"/>
+          <w:b w:val="0"/>
+          <w:sz w:val="19"/>
+        </w:rPr>
+        <w:t>│            ┌───────────────┐                          │</w:t>
+      </w:r>
+    </w:p>
+    <w:p>
+      <w:pPr>
+        <w:spacing w:line="240" w:lineRule="auto" w:before="0" w:after="0"/>
+      </w:pPr>
+      <w:r>
+        <w:rPr>
+          <w:rFonts w:ascii="Consolas" w:hAnsi="Consolas"/>
+          <w:b w:val="0"/>
+          <w:sz w:val="19"/>
+        </w:rPr>
+        <w:t>│            │  Schema RAG   │ ──► Milvus Vector DB     │</w:t>
+      </w:r>
+    </w:p>
+    <w:p>
+      <w:pPr>
+        <w:spacing w:line="240" w:lineRule="auto" w:before="0" w:after="0"/>
+      </w:pPr>
+      <w:r>
+        <w:rPr>
+          <w:rFonts w:ascii="Consolas" w:hAnsi="Consolas"/>
+          <w:b w:val="0"/>
+          <w:sz w:val="19"/>
+        </w:rPr>
+        <w:t>│            └───────┬───────┘                          │</w:t>
+      </w:r>
+    </w:p>
+    <w:p>
+      <w:pPr>
+        <w:spacing w:line="240" w:lineRule="auto" w:before="0" w:after="0"/>
+      </w:pPr>
+      <w:r>
+        <w:rPr>
+          <w:rFonts w:ascii="Consolas" w:hAnsi="Consolas"/>
+          <w:b w:val="0"/>
+          <w:sz w:val="19"/>
+        </w:rPr>
+        <w:t>│                    │                                  │</w:t>
+      </w:r>
+    </w:p>
+    <w:p>
+      <w:pPr>
+        <w:spacing w:line="240" w:lineRule="auto" w:before="0" w:after="0"/>
+      </w:pPr>
+      <w:r>
+        <w:rPr>
+          <w:rFonts w:ascii="Consolas" w:hAnsi="Consolas"/>
+          <w:b w:val="0"/>
+          <w:sz w:val="19"/>
+        </w:rPr>
+        <w:t>│                    ▼ (retrieved schema contexts)      │</w:t>
+      </w:r>
+    </w:p>
+    <w:p>
+      <w:pPr>
+        <w:spacing w:line="240" w:lineRule="auto" w:before="0" w:after="0"/>
+      </w:pPr>
+      <w:r>
+        <w:rPr>
+          <w:rFonts w:ascii="Consolas" w:hAnsi="Consolas"/>
+          <w:b w:val="0"/>
+          <w:sz w:val="19"/>
+        </w:rPr>
+        <w:t>│             [LLM Node] ◄─────────────────┐            │</w:t>
+      </w:r>
+    </w:p>
+    <w:p>
+      <w:pPr>
+        <w:spacing w:line="240" w:lineRule="auto" w:before="0" w:after="0"/>
+      </w:pPr>
+      <w:r>
+        <w:rPr>
+          <w:rFonts w:ascii="Consolas" w:hAnsi="Consolas"/>
+          <w:b w:val="0"/>
+          <w:sz w:val="19"/>
+        </w:rPr>
+        <w:t>│                    │                     │            │</w:t>
+      </w:r>
+    </w:p>
+    <w:p>
+      <w:pPr>
+        <w:spacing w:line="240" w:lineRule="auto" w:before="0" w:after="0"/>
+      </w:pPr>
+      <w:r>
+        <w:rPr>
+          <w:rFonts w:ascii="Consolas" w:hAnsi="Consolas"/>
+          <w:b w:val="0"/>
+          <w:sz w:val="19"/>
+        </w:rPr>
+        <w:t>│                    ▼ (calls execute_sql) │            │</w:t>
+      </w:r>
+    </w:p>
+    <w:p>
+      <w:pPr>
+        <w:spacing w:line="240" w:lineRule="auto" w:before="0" w:after="0"/>
+      </w:pPr>
+      <w:r>
+        <w:rPr>
+          <w:rFonts w:ascii="Consolas" w:hAnsi="Consolas"/>
+          <w:b w:val="0"/>
+          <w:sz w:val="19"/>
+        </w:rPr>
+        <w:t>│             [Tool Node]                  │ (Retry)    │</w:t>
+      </w:r>
+    </w:p>
+    <w:p>
+      <w:pPr>
+        <w:spacing w:line="240" w:lineRule="auto" w:before="0" w:after="0"/>
+      </w:pPr>
+      <w:r>
+        <w:rPr>
+          <w:rFonts w:ascii="Consolas" w:hAnsi="Consolas"/>
+          <w:b w:val="0"/>
+          <w:sz w:val="19"/>
+        </w:rPr>
+        <w:t>│                    │                     │            │</w:t>
+      </w:r>
+    </w:p>
+    <w:p>
+      <w:pPr>
+        <w:spacing w:line="240" w:lineRule="auto" w:before="0" w:after="0"/>
+      </w:pPr>
+      <w:r>
+        <w:rPr>
+          <w:rFonts w:ascii="Consolas" w:hAnsi="Consolas"/>
+          <w:b w:val="0"/>
+          <w:sz w:val="19"/>
+        </w:rPr>
+        <w:t>│                    ▼ (runs on DB)        │            │</w:t>
+      </w:r>
+    </w:p>
+    <w:p>
+      <w:pPr>
+        <w:spacing w:line="240" w:lineRule="auto" w:before="0" w:after="0"/>
+      </w:pPr>
+      <w:r>
+        <w:rPr>
+          <w:rFonts w:ascii="Consolas" w:hAnsi="Consolas"/>
+          <w:b w:val="0"/>
+          <w:sz w:val="19"/>
+        </w:rPr>
+        <w:t>│            ┌───────────────┐             │            │</w:t>
+      </w:r>
+    </w:p>
+    <w:p>
+      <w:pPr>
+        <w:spacing w:line="240" w:lineRule="auto" w:before="0" w:after="0"/>
+      </w:pPr>
+      <w:r>
+        <w:rPr>
+          <w:rFonts w:ascii="Consolas" w:hAnsi="Consolas"/>
+          <w:b w:val="0"/>
+          <w:sz w:val="19"/>
+        </w:rPr>
+        <w:t>│            │ Hive / Impala │             │            │</w:t>
+      </w:r>
+    </w:p>
+    <w:p>
+      <w:pPr>
+        <w:spacing w:line="240" w:lineRule="auto" w:before="0" w:after="0"/>
+      </w:pPr>
+      <w:r>
+        <w:rPr>
+          <w:rFonts w:ascii="Consolas" w:hAnsi="Consolas"/>
+          <w:b w:val="0"/>
+          <w:sz w:val="19"/>
+        </w:rPr>
+        <w:t>│            └───────┬───────┘             │            │</w:t>
+      </w:r>
+    </w:p>
+    <w:p>
+      <w:pPr>
+        <w:spacing w:line="240" w:lineRule="auto" w:before="0" w:after="0"/>
+      </w:pPr>
+      <w:r>
+        <w:rPr>
+          <w:rFonts w:ascii="Consolas" w:hAnsi="Consolas"/>
+          <w:b w:val="0"/>
+          <w:sz w:val="19"/>
+        </w:rPr>
+        <w:t>│                    │                     │            │</w:t>
+      </w:r>
+    </w:p>
+    <w:p>
+      <w:pPr>
+        <w:spacing w:line="240" w:lineRule="auto" w:before="0" w:after="0"/>
+      </w:pPr>
+      <w:r>
+        <w:rPr>
+          <w:rFonts w:ascii="Consolas" w:hAnsi="Consolas"/>
+          <w:b w:val="0"/>
+          <w:sz w:val="19"/>
+        </w:rPr>
+        <w:t>│                    ▼                     │            │</w:t>
+      </w:r>
+    </w:p>
+    <w:p>
+      <w:pPr>
+        <w:spacing w:line="240" w:lineRule="auto" w:before="0" w:after="0"/>
+      </w:pPr>
+      <w:r>
+        <w:rPr>
+          <w:rFonts w:ascii="Consolas" w:hAnsi="Consolas"/>
+          <w:b w:val="0"/>
+          <w:sz w:val="19"/>
+        </w:rPr>
+        <w:t>│             [Verify Node] ───────────────┘            │</w:t>
+      </w:r>
+    </w:p>
+    <w:p>
+      <w:pPr>
+        <w:spacing w:line="240" w:lineRule="auto" w:before="0" w:after="0"/>
+      </w:pPr>
+      <w:r>
+        <w:rPr>
+          <w:rFonts w:ascii="Consolas" w:hAnsi="Consolas"/>
+          <w:b w:val="0"/>
+          <w:sz w:val="19"/>
+        </w:rPr>
+        <w:t>│                    │ (Graded Correct)                 │</w:t>
+      </w:r>
+    </w:p>
+    <w:p>
+      <w:pPr>
+        <w:spacing w:line="240" w:lineRule="auto" w:before="0" w:after="0"/>
+      </w:pPr>
+      <w:r>
+        <w:rPr>
+          <w:rFonts w:ascii="Consolas" w:hAnsi="Consolas"/>
+          <w:b w:val="0"/>
+          <w:sz w:val="19"/>
+        </w:rPr>
+        <w:t>│                    ▼                                  │</w:t>
+      </w:r>
+    </w:p>
+    <w:p>
+      <w:pPr>
+        <w:spacing w:line="240" w:lineRule="auto" w:before="0" w:after="0"/>
+      </w:pPr>
+      <w:r>
+        <w:rPr>
+          <w:rFonts w:ascii="Consolas" w:hAnsi="Consolas"/>
+          <w:b w:val="0"/>
+          <w:sz w:val="19"/>
+        </w:rPr>
+        <w:t>│                   END ──► Final Response to User      │</w:t>
+      </w:r>
+    </w:p>
+    <w:p>
+      <w:pPr>
+        <w:spacing w:line="240" w:lineRule="auto" w:before="0" w:after="0"/>
+      </w:pPr>
+      <w:r>
+        <w:rPr>
+          <w:rFonts w:ascii="Consolas" w:hAnsi="Consolas"/>
+          <w:b w:val="0"/>
+          <w:sz w:val="19"/>
+        </w:rPr>
+        <w:t>└───────────────────────────────────────────────────────┘</w:t>
+      </w:r>
+    </w:p>
+    <w:p>
+      <w:pPr>
+        <w:spacing w:line="240" w:lineRule="auto" w:before="0" w:after="0"/>
+      </w:pPr>
+      <w:r>
+        <w:rPr>
+          <w:rFonts w:ascii="Consolas" w:hAnsi="Consolas"/>
+          <w:b w:val="0"/>
+          <w:sz w:val="19"/>
+        </w:rPr>
       </w:r>
     </w:p>
     <w:p>
@@ -222,8 +699,6 @@
         <w:rPr>
           <w:rFonts w:ascii="Times New Roman" w:hAnsi="Times New Roman"/>
           <w:b/>
-          <w:i w:val="0"/>
-          <w:color w:val="000000"/>
           <w:sz w:val="22"/>
         </w:rPr>
         <w:t xml:space="preserve">Semantic Retrieval Layer: </w:t>
@@ -232,11 +707,30 @@
         <w:rPr>
           <w:rFonts w:ascii="Times New Roman" w:hAnsi="Times New Roman"/>
           <w:b w:val="0"/>
-          <w:i w:val="0"/>
-          <w:color w:val="000000"/>
           <w:sz w:val="22"/>
         </w:rPr>
-        <w:t>Context Retrieval (Schema RAG): Utilizes Milvus-lite (local vector database) or ChromaDB as a semantic index. The repository DDLs, relationships, and business rules are chunked and indexed to support real-time context injection.</w:t>
+        <w:t>Context Retrieval (Schema RAG): Utilizes Milvus-lite (local vector database) or ChromaDB as a semantic index. The repository DDLs, relationships, and business rules are chunked and indexed to support real-time context injection [4].</w:t>
+      </w:r>
+    </w:p>
+    <w:p>
+      <w:pPr>
+        <w:pStyle w:val="ListBullet"/>
+      </w:pPr>
+      <w:r>
+        <w:rPr>
+          <w:rFonts w:ascii="Times New Roman" w:hAnsi="Times New Roman"/>
+          <w:b/>
+          <w:sz w:val="22"/>
+        </w:rPr>
+        <w:t xml:space="preserve">SQL Generation Layer: </w:t>
+      </w:r>
+      <w:r>
+        <w:rPr>
+          <w:rFonts w:ascii="Times New Roman" w:hAnsi="Times New Roman"/>
+          <w:b w:val="0"/>
+          <w:sz w:val="22"/>
+        </w:rPr>
+        <w:t>LLM Reasoning &amp; SQL Synthesis: Powered by ChatOllama running the qwen3.5 model. It acts as the core decision-making brain of the agent, consuming retrieved schema metadata to synthesize valid SQL SELECT queries and format the final answer. It communicates with the database layer using execution tools in a closed-loop trajectory.</w:t>
       </w:r>
     </w:p>
     <w:p>
@@ -274,8 +768,6 @@
         <w:rPr>
           <w:rFonts w:ascii="Times New Roman" w:hAnsi="Times New Roman"/>
           <w:b/>
-          <w:i w:val="0"/>
-          <w:color w:val="000000"/>
           <w:sz w:val="22"/>
         </w:rPr>
         <w:t xml:space="preserve">Database Layer: </w:t>
@@ -284,11 +776,9 @@
         <w:rPr>
           <w:rFonts w:ascii="Times New Roman" w:hAnsi="Times New Roman"/>
           <w:b w:val="0"/>
-          <w:i w:val="0"/>
-          <w:color w:val="000000"/>
           <w:sz w:val="22"/>
         </w:rPr>
-        <w:t>Execution Engines: Integrates with a local SQLite database for development and verification, and a remote Cloudera Data Platform (CDP) Impala VM running Apache Hive for production workloads.</w:t>
+        <w:t>Execution Engines: Integrates with a Cloudera Data Platform (CDP) Impala VM running Apache Hive for execution workloads.</w:t>
       </w:r>
     </w:p>
     <w:p>
@@ -304,7 +794,7 @@
           <w:color w:val="000000"/>
           <w:sz w:val="24"/>
         </w:rPr>
-        <w:t>2.2. Retrieval and Generation Boundaries (The Vanna Legacy)</w:t>
+        <w:t>2.2. Retrieval and Generation Boundaries</w:t>
       </w:r>
     </w:p>
     <w:p>
@@ -319,7 +809,7 @@
           <w:color w:val="000000"/>
           <w:sz w:val="22"/>
         </w:rPr>
-        <w:t>The design enforces a strict separation boundary between retrieval and code generation. Inspired by legacy Vanna (vanna==0.7.9 API) architectures, the semantic search index is used strictly to retrieve relevant DDL statements, join relations, and business logic. It does not perform SQL generation directly. This division ensures that the LLM performs reasoning over a controlled, minimal subset of table DDLs rather than attempting to parse the full database schema, reducing the context window size and minimizing token expenditure.</w:t>
+        <w:t>The design enforces a strict separation boundary between retrieval and code generation. The semantic search index is used strictly to retrieve relevant DDL statements, join relations, and business logic. It does not perform SQL generation directly. This division ensures that the LLM performs reasoning over a controlled, minimal subset of table DDLs rather than attempting to parse the full database schema, reducing the context window size and minimizing token expenditure.</w:t>
       </w:r>
     </w:p>
     <w:p>
@@ -471,8 +961,6 @@
         <w:rPr>
           <w:rFonts w:ascii="Times New Roman" w:hAnsi="Times New Roman"/>
           <w:b/>
-          <w:i w:val="0"/>
-          <w:color w:val="000000"/>
           <w:sz w:val="22"/>
         </w:rPr>
         <w:t xml:space="preserve">4. LLM Node: </w:t>
@@ -481,11 +969,9 @@
         <w:rPr>
           <w:rFonts w:ascii="Times New Roman" w:hAnsi="Times New Roman"/>
           <w:b w:val="0"/>
-          <w:i w:val="0"/>
-          <w:color w:val="000000"/>
           <w:sz w:val="22"/>
         </w:rPr>
-        <w:t>Invokes the LLM using the current chat history, retrieved schema contexts, and system prompts. If the LLM generates a tool call, the state transitions back to `tool_node`. Otherwise, the graph ends. Transition: LLM Node -&gt; Tool Node OR END.</w:t>
+        <w:t>Invokes the LLM using the current chat history, retrieved schema contexts, and system prompts. The LLM performs decomposed reasoning and in-context learning to synthesize SQL queries [1], [2]. If the LLM generates a tool call, the state transitions back to tool_node. Otherwise, the graph ends.</w:t>
       </w:r>
     </w:p>
     <w:p>
@@ -515,6 +1001,28 @@
       </w:r>
     </w:p>
     <w:p>
+      <w:pPr/>
+      <w:r>
+        <w:rPr>
+          <w:rFonts w:ascii="Times New Roman" w:hAnsi="Times New Roman"/>
+          <w:b/>
+          <w:sz w:val="24"/>
+        </w:rPr>
+        <w:t>3.2. Transition from Schema Linking to SQL Synthesis</w:t>
+      </w:r>
+    </w:p>
+    <w:p>
+      <w:pPr/>
+      <w:r>
+        <w:rPr>
+          <w:rFonts w:ascii="Times New Roman" w:hAnsi="Times New Roman"/>
+          <w:b w:val="0"/>
+          <w:sz w:val="22"/>
+        </w:rPr>
+        <w:t>Following the schema linking and retrieval phase, the orchestrator routes control to the SQL Generation Layer (LLM Node). The system prompts are dynamically populated with the retrieved DDLs, key constraints, and relevant few-shot SQL query examples returned by the Schema RAG. The LLM (qwen3.5) performs logical reasoning to bind the user's intent to the database physical schema, resolving join paths and formatting functions. To guarantee robust execution, the model binds directly to tool definitions, generating structured tool calls (e.g., execute_sql) rather than unstructured text [5]. If the model attempts to bypass database execution or generates invalid joins, prompt constraints nudge the model back to correct tool calls before a final answer can be synthesized.</w:t>
+      </w:r>
+    </w:p>
+    <w:p>
       <w:pPr>
         <w:keepNext/>
         <w:spacing w:before="240" w:after="80"/>
@@ -527,7 +1035,7 @@
           <w:color w:val="000000"/>
           <w:sz w:val="24"/>
         </w:rPr>
-        <w:t>3.2. Verification and Self-Healing Algorithmic Protocol</w:t>
+        <w:t>3.3. Verification and Self-Healing Algorithmic Protocol</w:t>
       </w:r>
     </w:p>
     <w:p>
@@ -538,11 +1046,9 @@
         <w:rPr>
           <w:rFonts w:ascii="Times New Roman" w:hAnsi="Times New Roman"/>
           <w:b w:val="0"/>
-          <w:i w:val="0"/>
-          <w:color w:val="000000"/>
           <w:sz w:val="22"/>
         </w:rPr>
-        <w:t>The self-healing cycle is one of the core mechanisms ensuring database stability on the production server. When a SQL execution fails due to a database exception (such as a misspelled column name or syntax error), the verify_node catches the exception and intercepts the flow. Instead of returning an error to the user, the node constructs a human-readable corrective prompt. This prompt includes the original query, the exact database error message, and a directive to correct the query based on the retrieved schema. This feedback loop runs up to a maximum limit (default: 10 verify loops) to prevent run-away token execution.</w:t>
+        <w:t>The self-healing cycle is one of the core mechanisms ensuring database stability on the production server. When a SQL execution fails due to a database exception (such as a misspelled column name or syntax error), the verify_node catches the exception and intercepts the flow. Instead of returning an error to the user, the node constructs a human-readable corrective prompt [1]. This prompt includes the original query, the exact database error message, and a directive to correct the query based on the retrieved schema. This feedback loop runs up to a maximum limit (default: 10 verify loops) to prevent run-away token execution.</w:t>
       </w:r>
     </w:p>
     <w:p>
@@ -1319,6 +1825,98 @@
         <w:t>During the benchmark execution, query `school_dropout_014` encountered a Connection Read Timeout error after 180.00 seconds. This exception was triggered due to port socket exhaustion on the local HTTP pool while communicating with the Ollama background service during an intensive verification loop. This highlights the need for a solid connection pool manager and appropriate rate limits on concurrent inference operations.</w:t>
       </w:r>
     </w:p>
+    <w:p>
+      <w:pPr/>
+    </w:p>
+    <w:p>
+      <w:pPr/>
+      <w:r>
+        <w:rPr>
+          <w:rFonts w:ascii="Times New Roman" w:hAnsi="Times New Roman"/>
+          <w:b/>
+          <w:sz w:val="24"/>
+        </w:rPr>
+        <w:t>7. References</w:t>
+      </w:r>
+    </w:p>
+    <w:p>
+      <w:pPr>
+        <w:spacing w:line="276" w:lineRule="auto" w:after="80"/>
+      </w:pPr>
+      <w:r>
+        <w:rPr>
+          <w:rFonts w:ascii="Times New Roman" w:hAnsi="Times New Roman"/>
+          <w:b w:val="0"/>
+          <w:sz w:val="22"/>
+        </w:rPr>
+        <w:t>[1] N. Pourreza and D. Rafiei, "DIN-SQL: Decomposed In-Context Learning of Text-to-SQL with Self-Correction," in Proceedings of the 37th Conference on Neural Information Processing Systems (NeurIPS), Dec. 2023.</w:t>
+      </w:r>
+    </w:p>
+    <w:p>
+      <w:pPr>
+        <w:spacing w:line="276" w:lineRule="auto" w:after="80"/>
+      </w:pPr>
+      <w:r>
+        <w:rPr>
+          <w:rFonts w:ascii="Times New Roman" w:hAnsi="Times New Roman"/>
+          <w:b w:val="0"/>
+          <w:sz w:val="22"/>
+        </w:rPr>
+        <w:t>[2] L. Dou, X. Gao, and J.-R. Wen, "DAIL-SQL: Towards Efficient and Effective Text-to-SQL with In-Context Learning," in Proceedings of the VLDB Endowment, vol. 17, no. 3, pp. 488-501, Nov. 2023.</w:t>
+      </w:r>
+    </w:p>
+    <w:p>
+      <w:pPr>
+        <w:spacing w:line="276" w:lineRule="auto" w:after="80"/>
+      </w:pPr>
+      <w:r>
+        <w:rPr>
+          <w:rFonts w:ascii="Times New Roman" w:hAnsi="Times New Roman"/>
+          <w:b w:val="0"/>
+          <w:sz w:val="22"/>
+        </w:rPr>
+        <w:t>[3] T. Yu, R. Zhang, K. Yasunaga, Y. C. Tan, A. Novikova, and D. Radev, "Spider: A Large-Scale Human-Labeled Dataset for Complex and Cross-Domain Semantic Parsing and Text-to-SQL," in Proceedings of the 2018 Conference on Empirical Methods in Natural Language Processing (EMNLP), Nov. 2018, pp. 3911-3921.</w:t>
+      </w:r>
+    </w:p>
+    <w:p>
+      <w:pPr>
+        <w:spacing w:line="276" w:lineRule="auto" w:after="80"/>
+      </w:pPr>
+      <w:r>
+        <w:rPr>
+          <w:rFonts w:ascii="Times New Roman" w:hAnsi="Times New Roman"/>
+          <w:b w:val="0"/>
+          <w:sz w:val="22"/>
+        </w:rPr>
+        <w:t>[4] P. Lewis et al., "Retrieval-Augmented Generation for Knowledge-Intensive NLP Tasks," in Proceedings of the 34th International Conference on Neural Information Processing Systems (NeurIPS), Dec. 2020.</w:t>
+      </w:r>
+    </w:p>
+    <w:p>
+      <w:pPr>
+        <w:spacing w:line="276" w:lineRule="auto" w:after="80"/>
+      </w:pPr>
+      <w:r>
+        <w:rPr>
+          <w:rFonts w:ascii="Times New Roman" w:hAnsi="Times New Roman"/>
+          <w:b w:val="0"/>
+          <w:sz w:val="22"/>
+        </w:rPr>
+        <w:t>[5] S. Yao, J. Zhao, D. Yu, N. Du, I. Shafran, K. Narasimhan, and Y. Cao, "ReAct: Synergizing Reasoning and Acting in Language Models," in International Conference on Learning Representations (ICLR), May 2023.</w:t>
+      </w:r>
+    </w:p>
+    <w:p>
+      <w:pPr>
+        <w:spacing w:line="276" w:lineRule="auto" w:after="80"/>
+      </w:pPr>
+      <w:r>
+        <w:rPr>
+          <w:rFonts w:ascii="Times New Roman" w:hAnsi="Times New Roman"/>
+          <w:b w:val="0"/>
+          <w:sz w:val="22"/>
+        </w:rPr>
+        <w:t>[6] C. Lei et al., "NL2SQL in Practice: Building and Deploying Semantic Parsing Systems for Enterprise Databases," IEEE Transactions on Knowledge and Data Engineering, vol. 35, no. 8, pp. 7845-7859, Aug. 2023.</w:t>
+      </w:r>
+    </w:p>
     <w:sectPr>
       <w:pgSz w:w="12240" w:h="15840"/>
       <w:pgMar w:top="1440" w:right="1440" w:bottom="1440" w:left="1440" w:header="720" w:footer="720" w:gutter="0"/>

</xml_diff>